<commit_message>
Finish Week01 (Document + Code)
</commit_message>
<xml_diff>
--- a/Laboratory/Lab01 - Getting Started/Lab01_Report-Truong_Ngoc_Gia_Hieu-SWS01217-105565520.docx
+++ b/Laboratory/Lab01 - Getting Started/Lab01_Report-Truong_Ngoc_Gia_Hieu-SWS01217-105565520.docx
@@ -1482,20 +1482,74 @@
           <w:szCs w:val="25"/>
           <w:lang w:val="en-US"/>
         </w:rPr>
-        <w:t xml:space="preserve">- Consequently, I utilized </w:t>
-      </w:r>
-      <w:r>
-        <w:rPr>
-          <w:rFonts w:hint="default" w:ascii="Times New Roman" w:hAnsi="Times New Roman" w:eastAsia="SimSun" w:cs="Times New Roman"/>
-          <w:b/>
-          <w:bCs/>
-          <w:i/>
-          <w:iCs/>
-          <w:sz w:val="25"/>
-          <w:szCs w:val="25"/>
-          <w:lang w:val="en-US"/>
-        </w:rPr>
-        <w:t>.describe()</w:t>
+        <w:t xml:space="preserve">- By using the </w:t>
+      </w:r>
+      <w:r>
+        <w:rPr>
+          <w:rStyle w:val="17"/>
+          <w:rFonts w:hint="default" w:ascii="Times New Roman" w:hAnsi="Times New Roman" w:eastAsia="SimSun" w:cs="Times New Roman"/>
+          <w:b/>
+          <w:bCs/>
+          <w:i/>
+          <w:iCs/>
+          <w:sz w:val="25"/>
+          <w:szCs w:val="25"/>
+        </w:rPr>
+        <w:t>.info()</w:t>
+      </w:r>
+      <w:r>
+        <w:rPr>
+          <w:rStyle w:val="17"/>
+          <w:rFonts w:hint="default" w:ascii="Times New Roman" w:hAnsi="Times New Roman" w:eastAsia="SimSun" w:cs="Times New Roman"/>
+          <w:b/>
+          <w:bCs/>
+          <w:i/>
+          <w:iCs/>
+          <w:sz w:val="25"/>
+          <w:szCs w:val="25"/>
+          <w:lang w:val="en-US"/>
+        </w:rPr>
+        <w:t xml:space="preserve"> </w:t>
+      </w:r>
+      <w:r>
+        <w:rPr>
+          <w:rStyle w:val="17"/>
+          <w:rFonts w:hint="default" w:ascii="Times New Roman" w:hAnsi="Times New Roman" w:eastAsia="SimSun" w:cs="Times New Roman"/>
+          <w:b w:val="0"/>
+          <w:bCs w:val="0"/>
+          <w:i w:val="0"/>
+          <w:iCs w:val="0"/>
+          <w:sz w:val="25"/>
+          <w:szCs w:val="25"/>
+          <w:lang w:val="en-US"/>
+        </w:rPr>
+        <w:t xml:space="preserve">method, I see that there are 12 columns or features distinctively including PassengerID, Name, Pclass, and so on. Besides that, the method also highlights how many non-null values in each feature and data type which helps identify whether any missing values exist. As well as the data type of column. For instance, the column PassengerId has 891 values non-null value and has Integer type. </w:t>
+      </w:r>
+      <w:r>
+        <w:rPr>
+          <w:rFonts w:hint="default" w:ascii="Times New Roman" w:hAnsi="Times New Roman" w:eastAsia="SimSun" w:cs="Times New Roman"/>
+          <w:b w:val="0"/>
+          <w:bCs w:val="0"/>
+          <w:i w:val="0"/>
+          <w:iCs w:val="0"/>
+          <w:sz w:val="25"/>
+          <w:szCs w:val="25"/>
+          <w:lang w:val="en-US"/>
+        </w:rPr>
+        <w:t xml:space="preserve">Consequently, I utilized </w:t>
+      </w:r>
+      <w:r>
+        <w:rPr>
+          <w:rFonts w:hint="default" w:ascii="Times New Roman" w:hAnsi="Times New Roman" w:eastAsia="SimSun" w:cs="Times New Roman"/>
+          <w:b/>
+          <w:bCs/>
+          <w:i/>
+          <w:iCs/>
+          <w:sz w:val="25"/>
+          <w:szCs w:val="25"/>
+          <w:lang w:val="en-US"/>
+        </w:rPr>
+        <w:t xml:space="preserve">.describe() </w:t>
       </w:r>
       <w:r>
         <w:rPr>
@@ -1648,7 +1702,7 @@
           <w:szCs w:val="25"/>
           <w:lang w:val="en-US"/>
         </w:rPr>
-        <w:t xml:space="preserve">- In Drawing Graph part, I decide to draw a bar chart to showcase relationship between Sex(Gender =&gt; X) and Survived(Y) </w:t>
+        <w:t>- In Drawing Graph part, I decide to draw a bar chart to showcase relationship between Sex(Gender =&gt; X) and Survived(Y). Based on the bar chart, it showcases that regarding female gender, more than 200 people survived while near ly 100 were not. In constrast, the ratio of not survived of male sex significantly reacher from 450 to 460 people while survived gained precisely at 100 people.</w:t>
       </w:r>
     </w:p>
     <w:p>
@@ -2364,9 +2418,161 @@
         <w:widowControl/>
         <w:suppressLineNumbers w:val="0"/>
         <w:jc w:val="both"/>
+        <w:rPr>
+          <w:rFonts w:hint="default"/>
+          <w:b w:val="0"/>
+          <w:bCs w:val="0"/>
+          <w:i w:val="0"/>
+          <w:iCs w:val="0"/>
+          <w:lang w:val="en-US"/>
+        </w:rPr>
       </w:pPr>
       <w:r>
-        <w:t>To further explore the Titanic dataset, additional exploratory data analysis (EDA) was conducted to identify potential relationships between passenger characteristics and survival outcomes.</w:t>
+        <w:rPr>
+          <w:rFonts w:hint="default"/>
+          <w:b w:val="0"/>
+          <w:bCs w:val="0"/>
+          <w:i w:val="0"/>
+          <w:iCs w:val="0"/>
+          <w:lang w:val="en-US"/>
+        </w:rPr>
+        <w:t xml:space="preserve">First and foremost, I generate pie charts to showcase relationship between </w:t>
+      </w:r>
+      <w:r>
+        <w:rPr>
+          <w:rFonts w:hint="default"/>
+          <w:b/>
+          <w:bCs/>
+          <w:i/>
+          <w:iCs/>
+          <w:lang w:val="en-US"/>
+        </w:rPr>
+        <w:t xml:space="preserve">Pclass </w:t>
+      </w:r>
+      <w:r>
+        <w:rPr>
+          <w:rFonts w:hint="default"/>
+          <w:b w:val="0"/>
+          <w:bCs w:val="0"/>
+          <w:i w:val="0"/>
+          <w:iCs w:val="0"/>
+          <w:lang w:val="en-US"/>
+        </w:rPr>
+        <w:t xml:space="preserve">and </w:t>
+      </w:r>
+      <w:r>
+        <w:rPr>
+          <w:rFonts w:hint="default"/>
+          <w:b/>
+          <w:bCs/>
+          <w:i/>
+          <w:iCs/>
+          <w:lang w:val="en-US"/>
+        </w:rPr>
+        <w:t xml:space="preserve">Survived </w:t>
+      </w:r>
+      <w:r>
+        <w:rPr>
+          <w:rFonts w:hint="default"/>
+          <w:b w:val="0"/>
+          <w:bCs w:val="0"/>
+          <w:i w:val="0"/>
+          <w:iCs w:val="0"/>
+          <w:lang w:val="en-US"/>
+        </w:rPr>
+        <w:t>among three classes including First, Second, Third.</w:t>
+      </w:r>
+    </w:p>
+    <w:p>
+      <w:pPr>
+        <w:pStyle w:val="19"/>
+        <w:keepNext w:val="0"/>
+        <w:keepLines w:val="0"/>
+        <w:widowControl/>
+        <w:suppressLineNumbers w:val="0"/>
+        <w:jc w:val="center"/>
+        <w:rPr>
+          <w:rFonts w:hint="default"/>
+          <w:b/>
+          <w:bCs/>
+          <w:i/>
+          <w:iCs/>
+          <w:sz w:val="21"/>
+          <w:szCs w:val="21"/>
+          <w:lang w:val="en-US"/>
+        </w:rPr>
+      </w:pPr>
+      <w:r>
+        <w:rPr>
+          <w:b/>
+          <w:bCs/>
+          <w:i/>
+          <w:iCs/>
+          <w:sz w:val="21"/>
+          <w:szCs w:val="21"/>
+        </w:rPr>
+        <w:drawing>
+          <wp:anchor distT="0" distB="0" distL="114300" distR="114300" simplePos="0" relativeHeight="251669504" behindDoc="0" locked="0" layoutInCell="1" allowOverlap="1">
+            <wp:simplePos x="0" y="0"/>
+            <wp:positionH relativeFrom="column">
+              <wp:posOffset>3175</wp:posOffset>
+            </wp:positionH>
+            <wp:positionV relativeFrom="paragraph">
+              <wp:posOffset>0</wp:posOffset>
+            </wp:positionV>
+            <wp:extent cx="5271135" cy="2845435"/>
+            <wp:effectExtent l="0" t="0" r="1905" b="4445"/>
+            <wp:wrapSquare wrapText="bothSides"/>
+            <wp:docPr id="1" name="Picture 1"/>
+            <wp:cNvGraphicFramePr>
+              <a:graphicFrameLocks xmlns:a="http://schemas.openxmlformats.org/drawingml/2006/main" noChangeAspect="1"/>
+            </wp:cNvGraphicFramePr>
+            <a:graphic xmlns:a="http://schemas.openxmlformats.org/drawingml/2006/main">
+              <a:graphicData uri="http://schemas.openxmlformats.org/drawingml/2006/picture">
+                <pic:pic xmlns:pic="http://schemas.openxmlformats.org/drawingml/2006/picture">
+                  <pic:nvPicPr>
+                    <pic:cNvPr id="1" name="Picture 1"/>
+                    <pic:cNvPicPr>
+                      <a:picLocks noChangeAspect="1"/>
+                    </pic:cNvPicPr>
+                  </pic:nvPicPr>
+                  <pic:blipFill>
+                    <a:blip r:embed="rId14"/>
+                    <a:stretch>
+                      <a:fillRect/>
+                    </a:stretch>
+                  </pic:blipFill>
+                  <pic:spPr>
+                    <a:xfrm>
+                      <a:off x="0" y="0"/>
+                      <a:ext cx="5271135" cy="2845435"/>
+                    </a:xfrm>
+                    <a:prstGeom prst="rect">
+                      <a:avLst/>
+                    </a:prstGeom>
+                    <a:noFill/>
+                    <a:ln>
+                      <a:noFill/>
+                    </a:ln>
+                  </pic:spPr>
+                </pic:pic>
+              </a:graphicData>
+            </a:graphic>
+          </wp:anchor>
+        </w:drawing>
+      </w:r>
+      <w:r>
+        <w:rPr>
+          <w:rFonts w:hint="default"/>
+          <w:b/>
+          <w:bCs/>
+          <w:i/>
+          <w:iCs/>
+          <w:sz w:val="21"/>
+          <w:szCs w:val="21"/>
+          <w:lang w:val="en-US"/>
+        </w:rPr>
+        <w:t>Figure 5: Survival Distribution by Passenger Class</w:t>
       </w:r>
     </w:p>
     <w:p>
@@ -2377,27 +2583,17 @@
         <w:widowControl/>
         <w:suppressLineNumbers w:val="0"/>
         <w:jc w:val="both"/>
+        <w:rPr>
+          <w:rFonts w:hint="default"/>
+          <w:lang w:val="en-US"/>
+        </w:rPr>
       </w:pPr>
       <w:r>
-        <w:t>Firstly, a comparison between passenger class (</w:t>
-      </w:r>
-      <w:r>
-        <w:rPr>
-          <w:rStyle w:val="20"/>
-        </w:rPr>
-        <w:t>Pclass</w:t>
-      </w:r>
-      <w:r>
-        <w:t>) and survival status (</w:t>
-      </w:r>
-      <w:r>
-        <w:rPr>
-          <w:rStyle w:val="20"/>
-        </w:rPr>
-        <w:t>Survived</w:t>
-      </w:r>
-      <w:r>
-        <w:t>) was performed. The visualisation helps determine whether travelling class had an influence on survival probability. The analysis indicates that passengers travelling in higher classes generally achieved better survival outcomes compared to those travelling in lower classes.</w:t>
+        <w:rPr>
+          <w:rFonts w:hint="default"/>
+          <w:lang w:val="en-US"/>
+        </w:rPr>
+        <w:t>The above pie charts shows that the percentage of the first class for survived was 63% while not survived less than 26%. Furthermore, the number of did not survive and survived belongs to second class were 52.7% and 47.3% respectively. Lastly, the survived ratio of third class took one-fourth of total, particularly 24.2%.</w:t>
       </w:r>
     </w:p>
     <w:p>
@@ -2408,15 +2604,11 @@
         <w:widowControl/>
         <w:suppressLineNumbers w:val="0"/>
         <w:jc w:val="both"/>
+        <w:rPr>
+          <w:rFonts w:hint="default"/>
+          <w:lang w:val="en-US"/>
+        </w:rPr>
       </w:pPr>
-      <w:r>
-        <w:t>Secondly, the age distribution of passengers was examine</w:t>
-      </w:r>
-      <w:bookmarkStart w:id="0" w:name="_GoBack"/>
-      <w:bookmarkEnd w:id="0"/>
-      <w:r>
-        <w:t>d using a histogram. This visualisation provides an overview of the age range represented in the dataset and identifies the age groups that make up the majority of passengers. Understanding the age distribution is important for determining whether age may play a role in survival outcomes.</w:t>
-      </w:r>
     </w:p>
     <w:p>
       <w:pPr>
@@ -2426,10 +2618,11 @@
         <w:widowControl/>
         <w:suppressLineNumbers w:val="0"/>
         <w:jc w:val="both"/>
+        <w:rPr>
+          <w:rFonts w:hint="default"/>
+          <w:lang w:val="en-US"/>
+        </w:rPr>
       </w:pPr>
-      <w:r>
-        <w:t>Furthermore, a boxplot was created to investigate the relationship between passenger age and survival status. By comparing the age distributions of survivors and non-survivors, it becomes possible to observe whether certain age groups experienced higher survival rates during the disaster.</w:t>
-      </w:r>
     </w:p>
     <w:p>
       <w:pPr>
@@ -2439,19 +2632,11 @@
         <w:widowControl/>
         <w:suppressLineNumbers w:val="0"/>
         <w:jc w:val="both"/>
+        <w:rPr>
+          <w:rFonts w:hint="default"/>
+          <w:lang w:val="en-US"/>
+        </w:rPr>
       </w:pPr>
-      <w:r>
-        <w:t>In addition, the relationship between ticket fare (</w:t>
-      </w:r>
-      <w:r>
-        <w:rPr>
-          <w:rStyle w:val="20"/>
-        </w:rPr>
-        <w:t>Fare</w:t>
-      </w:r>
-      <w:r>
-        <w:t>) and survival status was analysed. Since ticket fare is closely associated with passenger class and travel conditions, examining this feature provides additional insight into factors that may have influenced survival outcomes. The visualisation suggests that passengers who paid higher fares generally had a greater likelihood of survival.</w:t>
-      </w:r>
     </w:p>
     <w:p>
       <w:pPr>
@@ -2461,10 +2646,11 @@
         <w:widowControl/>
         <w:suppressLineNumbers w:val="0"/>
         <w:jc w:val="both"/>
+        <w:rPr>
+          <w:rFonts w:hint="default"/>
+          <w:lang w:val="en-US"/>
+        </w:rPr>
       </w:pPr>
-      <w:r>
-        <w:t>Finally, a correlation heatmap was generated to examine relationships among the numerical variables within the dataset. The heatmap highlights the strength of correlations between features and helps identify variables that may be useful for future machine learning modelling.</w:t>
-      </w:r>
     </w:p>
     <w:p>
       <w:pPr>
@@ -2474,51 +2660,458 @@
         <w:widowControl/>
         <w:suppressLineNumbers w:val="0"/>
         <w:jc w:val="both"/>
+        <w:rPr>
+          <w:rFonts w:hint="default"/>
+          <w:lang w:val="en-US"/>
+        </w:rPr>
       </w:pPr>
-      <w:r>
-        <w:t>Overall, the extended exploratory analysis provides a deeper understanding of the Titanic dataset and reveals several factors that appear to be associated with passenger survival. These findings may assist in selecting relevant features for future predictive machine learning models.</w:t>
+    </w:p>
+    <w:p>
+      <w:pPr>
+        <w:pStyle w:val="19"/>
+        <w:keepNext w:val="0"/>
+        <w:keepLines w:val="0"/>
+        <w:widowControl/>
+        <w:suppressLineNumbers w:val="0"/>
+        <w:jc w:val="both"/>
+        <w:rPr>
+          <w:rFonts w:hint="default"/>
+          <w:lang w:val="en-US"/>
+        </w:rPr>
+      </w:pPr>
+    </w:p>
+    <w:p>
+      <w:pPr>
+        <w:pStyle w:val="19"/>
+        <w:keepNext w:val="0"/>
+        <w:keepLines w:val="0"/>
+        <w:widowControl/>
+        <w:suppressLineNumbers w:val="0"/>
+        <w:jc w:val="both"/>
+        <w:rPr>
+          <w:rFonts w:hint="default"/>
+          <w:lang w:val="en-US"/>
+        </w:rPr>
+      </w:pPr>
+    </w:p>
+    <w:p>
+      <w:pPr>
+        <w:pStyle w:val="19"/>
+        <w:keepNext w:val="0"/>
+        <w:keepLines w:val="0"/>
+        <w:widowControl/>
+        <w:suppressLineNumbers w:val="0"/>
+        <w:jc w:val="both"/>
+        <w:rPr>
+          <w:rFonts w:hint="default"/>
+          <w:lang w:val="en-US"/>
+        </w:rPr>
+      </w:pPr>
+    </w:p>
+    <w:p>
+      <w:pPr>
+        <w:pStyle w:val="19"/>
+        <w:keepNext w:val="0"/>
+        <w:keepLines w:val="0"/>
+        <w:widowControl/>
+        <w:suppressLineNumbers w:val="0"/>
+        <w:jc w:val="both"/>
+        <w:rPr>
+          <w:rFonts w:hint="default"/>
+          <w:lang w:val="en-US"/>
+        </w:rPr>
+      </w:pPr>
+      <w:r>
+        <w:drawing>
+          <wp:anchor distT="0" distB="0" distL="114300" distR="114300" simplePos="0" relativeHeight="251670528" behindDoc="0" locked="0" layoutInCell="1" allowOverlap="1">
+            <wp:simplePos x="0" y="0"/>
+            <wp:positionH relativeFrom="column">
+              <wp:posOffset>354965</wp:posOffset>
+            </wp:positionH>
+            <wp:positionV relativeFrom="paragraph">
+              <wp:posOffset>609600</wp:posOffset>
+            </wp:positionV>
+            <wp:extent cx="4567555" cy="3991610"/>
+            <wp:effectExtent l="0" t="0" r="4445" b="1270"/>
+            <wp:wrapSquare wrapText="bothSides"/>
+            <wp:docPr id="8" name="Picture 3"/>
+            <wp:cNvGraphicFramePr>
+              <a:graphicFrameLocks xmlns:a="http://schemas.openxmlformats.org/drawingml/2006/main" noChangeAspect="1"/>
+            </wp:cNvGraphicFramePr>
+            <a:graphic xmlns:a="http://schemas.openxmlformats.org/drawingml/2006/main">
+              <a:graphicData uri="http://schemas.openxmlformats.org/drawingml/2006/picture">
+                <pic:pic xmlns:pic="http://schemas.openxmlformats.org/drawingml/2006/picture">
+                  <pic:nvPicPr>
+                    <pic:cNvPr id="8" name="Picture 3"/>
+                    <pic:cNvPicPr>
+                      <a:picLocks noChangeAspect="1"/>
+                    </pic:cNvPicPr>
+                  </pic:nvPicPr>
+                  <pic:blipFill>
+                    <a:blip r:embed="rId15"/>
+                    <a:stretch>
+                      <a:fillRect/>
+                    </a:stretch>
+                  </pic:blipFill>
+                  <pic:spPr>
+                    <a:xfrm>
+                      <a:off x="0" y="0"/>
+                      <a:ext cx="4567555" cy="3991610"/>
+                    </a:xfrm>
+                    <a:prstGeom prst="rect">
+                      <a:avLst/>
+                    </a:prstGeom>
+                    <a:noFill/>
+                    <a:ln>
+                      <a:noFill/>
+                    </a:ln>
+                  </pic:spPr>
+                </pic:pic>
+              </a:graphicData>
+            </a:graphic>
+          </wp:anchor>
+        </w:drawing>
+      </w:r>
+      <w:r>
+        <w:rPr>
+          <w:rFonts w:hint="default"/>
+          <w:lang w:val="en-US"/>
+        </w:rPr>
+        <w:t>Additionally, I use the histogram to highlight which age group has most majority in the dataset.</w:t>
       </w:r>
     </w:p>
     <w:p>
       <w:pPr>
         <w:numPr>
+          <w:ilvl w:val="0"/>
           <w:numId w:val="0"/>
         </w:numPr>
         <w:shd w:val="clear" w:fill="FFFFFF" w:themeFill="background1"/>
         <w:spacing w:line="240" w:lineRule="auto"/>
-        <w:ind w:leftChars="0"/>
-        <w:jc w:val="both"/>
-        <w:rPr>
-          <w:rFonts w:hint="default" w:ascii="Times New Roman" w:hAnsi="Times New Roman" w:cs="Times New Roman"/>
-          <w:b/>
-          <w:bCs/>
-          <w:i/>
-          <w:iCs/>
-          <w:sz w:val="25"/>
-          <w:szCs w:val="25"/>
+        <w:jc w:val="center"/>
+        <w:rPr>
+          <w:rFonts w:hint="default" w:ascii="Times New Roman" w:hAnsi="Times New Roman" w:eastAsia="SimSun" w:cs="Times New Roman"/>
+          <w:b/>
+          <w:bCs/>
+          <w:i/>
+          <w:iCs/>
+          <w:sz w:val="21"/>
+          <w:szCs w:val="21"/>
           <w:lang w:val="en-US"/>
         </w:rPr>
       </w:pPr>
-    </w:p>
-    <w:p>
-      <w:pPr>
-        <w:numPr>
-          <w:numId w:val="0"/>
-        </w:numPr>
-        <w:shd w:val="clear" w:fill="FFFFFF" w:themeFill="background1"/>
-        <w:spacing w:line="240" w:lineRule="auto"/>
-        <w:jc w:val="both"/>
-        <w:rPr>
-          <w:rFonts w:hint="default" w:ascii="Times New Roman" w:hAnsi="Times New Roman" w:cs="Times New Roman"/>
-          <w:b/>
-          <w:bCs/>
-          <w:i/>
-          <w:iCs/>
-          <w:sz w:val="25"/>
-          <w:szCs w:val="25"/>
-          <w:lang w:val="en-US"/>
-        </w:rPr>
-      </w:pPr>
+      <w:r>
+        <w:rPr>
+          <w:rFonts w:hint="default" w:ascii="Times New Roman" w:hAnsi="Times New Roman" w:eastAsia="SimSun" w:cs="Times New Roman"/>
+          <w:b w:val="0"/>
+          <w:bCs w:val="0"/>
+          <w:i w:val="0"/>
+          <w:iCs w:val="0"/>
+          <w:sz w:val="25"/>
+          <w:szCs w:val="25"/>
+          <w:lang w:val="en-US"/>
+        </w:rPr>
+        <w:br w:type="textWrapping"/>
+      </w:r>
+      <w:r>
+        <w:rPr>
+          <w:rFonts w:hint="default" w:ascii="Times New Roman" w:hAnsi="Times New Roman" w:eastAsia="SimSun" w:cs="Times New Roman"/>
+          <w:b w:val="0"/>
+          <w:bCs w:val="0"/>
+          <w:i w:val="0"/>
+          <w:iCs w:val="0"/>
+          <w:sz w:val="25"/>
+          <w:szCs w:val="25"/>
+          <w:lang w:val="en-US"/>
+        </w:rPr>
+        <w:br w:type="textWrapping"/>
+      </w:r>
+      <w:r>
+        <w:rPr>
+          <w:rFonts w:hint="default" w:ascii="Times New Roman" w:hAnsi="Times New Roman" w:eastAsia="SimSun" w:cs="Times New Roman"/>
+          <w:b w:val="0"/>
+          <w:bCs w:val="0"/>
+          <w:i w:val="0"/>
+          <w:iCs w:val="0"/>
+          <w:sz w:val="25"/>
+          <w:szCs w:val="25"/>
+          <w:lang w:val="en-US"/>
+        </w:rPr>
+        <w:br w:type="textWrapping"/>
+      </w:r>
+      <w:r>
+        <w:rPr>
+          <w:rFonts w:hint="default" w:ascii="Times New Roman" w:hAnsi="Times New Roman" w:eastAsia="SimSun" w:cs="Times New Roman"/>
+          <w:b w:val="0"/>
+          <w:bCs w:val="0"/>
+          <w:i w:val="0"/>
+          <w:iCs w:val="0"/>
+          <w:sz w:val="25"/>
+          <w:szCs w:val="25"/>
+          <w:lang w:val="en-US"/>
+        </w:rPr>
+        <w:br w:type="textWrapping"/>
+      </w:r>
+      <w:r>
+        <w:rPr>
+          <w:rFonts w:hint="default" w:ascii="Times New Roman" w:hAnsi="Times New Roman" w:eastAsia="SimSun" w:cs="Times New Roman"/>
+          <w:b w:val="0"/>
+          <w:bCs w:val="0"/>
+          <w:i w:val="0"/>
+          <w:iCs w:val="0"/>
+          <w:sz w:val="25"/>
+          <w:szCs w:val="25"/>
+          <w:lang w:val="en-US"/>
+        </w:rPr>
+        <w:br w:type="textWrapping"/>
+      </w:r>
+      <w:r>
+        <w:rPr>
+          <w:rFonts w:hint="default" w:ascii="Times New Roman" w:hAnsi="Times New Roman" w:eastAsia="SimSun" w:cs="Times New Roman"/>
+          <w:b w:val="0"/>
+          <w:bCs w:val="0"/>
+          <w:i w:val="0"/>
+          <w:iCs w:val="0"/>
+          <w:sz w:val="25"/>
+          <w:szCs w:val="25"/>
+          <w:lang w:val="en-US"/>
+        </w:rPr>
+        <w:br w:type="textWrapping"/>
+      </w:r>
+      <w:r>
+        <w:rPr>
+          <w:rFonts w:hint="default" w:ascii="Times New Roman" w:hAnsi="Times New Roman" w:eastAsia="SimSun" w:cs="Times New Roman"/>
+          <w:b w:val="0"/>
+          <w:bCs w:val="0"/>
+          <w:i w:val="0"/>
+          <w:iCs w:val="0"/>
+          <w:sz w:val="25"/>
+          <w:szCs w:val="25"/>
+          <w:lang w:val="en-US"/>
+        </w:rPr>
+        <w:br w:type="textWrapping"/>
+      </w:r>
+      <w:r>
+        <w:rPr>
+          <w:rFonts w:hint="default" w:ascii="Times New Roman" w:hAnsi="Times New Roman" w:eastAsia="SimSun" w:cs="Times New Roman"/>
+          <w:b w:val="0"/>
+          <w:bCs w:val="0"/>
+          <w:i w:val="0"/>
+          <w:iCs w:val="0"/>
+          <w:sz w:val="25"/>
+          <w:szCs w:val="25"/>
+          <w:lang w:val="en-US"/>
+        </w:rPr>
+        <w:br w:type="textWrapping"/>
+      </w:r>
+      <w:r>
+        <w:rPr>
+          <w:rFonts w:hint="default" w:ascii="Times New Roman" w:hAnsi="Times New Roman" w:eastAsia="SimSun" w:cs="Times New Roman"/>
+          <w:b w:val="0"/>
+          <w:bCs w:val="0"/>
+          <w:i w:val="0"/>
+          <w:iCs w:val="0"/>
+          <w:sz w:val="25"/>
+          <w:szCs w:val="25"/>
+          <w:lang w:val="en-US"/>
+        </w:rPr>
+        <w:br w:type="textWrapping"/>
+      </w:r>
+      <w:r>
+        <w:rPr>
+          <w:rFonts w:hint="default" w:ascii="Times New Roman" w:hAnsi="Times New Roman" w:eastAsia="SimSun" w:cs="Times New Roman"/>
+          <w:b w:val="0"/>
+          <w:bCs w:val="0"/>
+          <w:i w:val="0"/>
+          <w:iCs w:val="0"/>
+          <w:sz w:val="25"/>
+          <w:szCs w:val="25"/>
+          <w:lang w:val="en-US"/>
+        </w:rPr>
+        <w:br w:type="textWrapping"/>
+      </w:r>
+      <w:r>
+        <w:rPr>
+          <w:rFonts w:hint="default" w:ascii="Times New Roman" w:hAnsi="Times New Roman" w:eastAsia="SimSun" w:cs="Times New Roman"/>
+          <w:b w:val="0"/>
+          <w:bCs w:val="0"/>
+          <w:i w:val="0"/>
+          <w:iCs w:val="0"/>
+          <w:sz w:val="25"/>
+          <w:szCs w:val="25"/>
+          <w:lang w:val="en-US"/>
+        </w:rPr>
+        <w:br w:type="textWrapping"/>
+      </w:r>
+      <w:r>
+        <w:rPr>
+          <w:rFonts w:hint="default" w:ascii="Times New Roman" w:hAnsi="Times New Roman" w:eastAsia="SimSun" w:cs="Times New Roman"/>
+          <w:b w:val="0"/>
+          <w:bCs w:val="0"/>
+          <w:i w:val="0"/>
+          <w:iCs w:val="0"/>
+          <w:sz w:val="25"/>
+          <w:szCs w:val="25"/>
+          <w:lang w:val="en-US"/>
+        </w:rPr>
+        <w:br w:type="textWrapping"/>
+      </w:r>
+      <w:r>
+        <w:rPr>
+          <w:rFonts w:hint="default" w:ascii="Times New Roman" w:hAnsi="Times New Roman" w:eastAsia="SimSun" w:cs="Times New Roman"/>
+          <w:b w:val="0"/>
+          <w:bCs w:val="0"/>
+          <w:i w:val="0"/>
+          <w:iCs w:val="0"/>
+          <w:sz w:val="25"/>
+          <w:szCs w:val="25"/>
+          <w:lang w:val="en-US"/>
+        </w:rPr>
+        <w:br w:type="textWrapping"/>
+      </w:r>
+      <w:r>
+        <w:rPr>
+          <w:rFonts w:hint="default" w:ascii="Times New Roman" w:hAnsi="Times New Roman" w:eastAsia="SimSun" w:cs="Times New Roman"/>
+          <w:b w:val="0"/>
+          <w:bCs w:val="0"/>
+          <w:i w:val="0"/>
+          <w:iCs w:val="0"/>
+          <w:sz w:val="25"/>
+          <w:szCs w:val="25"/>
+          <w:lang w:val="en-US"/>
+        </w:rPr>
+        <w:br w:type="textWrapping"/>
+      </w:r>
+      <w:r>
+        <w:rPr>
+          <w:rFonts w:hint="default" w:ascii="Times New Roman" w:hAnsi="Times New Roman" w:eastAsia="SimSun" w:cs="Times New Roman"/>
+          <w:b w:val="0"/>
+          <w:bCs w:val="0"/>
+          <w:i w:val="0"/>
+          <w:iCs w:val="0"/>
+          <w:sz w:val="25"/>
+          <w:szCs w:val="25"/>
+          <w:lang w:val="en-US"/>
+        </w:rPr>
+        <w:br w:type="textWrapping"/>
+      </w:r>
+      <w:r>
+        <w:rPr>
+          <w:rFonts w:hint="default" w:ascii="Times New Roman" w:hAnsi="Times New Roman" w:eastAsia="SimSun" w:cs="Times New Roman"/>
+          <w:b w:val="0"/>
+          <w:bCs w:val="0"/>
+          <w:i w:val="0"/>
+          <w:iCs w:val="0"/>
+          <w:sz w:val="25"/>
+          <w:szCs w:val="25"/>
+          <w:lang w:val="en-US"/>
+        </w:rPr>
+        <w:br w:type="textWrapping"/>
+      </w:r>
+      <w:r>
+        <w:rPr>
+          <w:rFonts w:hint="default" w:ascii="Times New Roman" w:hAnsi="Times New Roman" w:eastAsia="SimSun" w:cs="Times New Roman"/>
+          <w:b w:val="0"/>
+          <w:bCs w:val="0"/>
+          <w:i w:val="0"/>
+          <w:iCs w:val="0"/>
+          <w:sz w:val="25"/>
+          <w:szCs w:val="25"/>
+          <w:lang w:val="en-US"/>
+        </w:rPr>
+        <w:br w:type="textWrapping"/>
+      </w:r>
+      <w:r>
+        <w:rPr>
+          <w:rFonts w:hint="default" w:ascii="Times New Roman" w:hAnsi="Times New Roman" w:eastAsia="SimSun" w:cs="Times New Roman"/>
+          <w:b w:val="0"/>
+          <w:bCs w:val="0"/>
+          <w:i w:val="0"/>
+          <w:iCs w:val="0"/>
+          <w:sz w:val="25"/>
+          <w:szCs w:val="25"/>
+          <w:lang w:val="en-US"/>
+        </w:rPr>
+        <w:br w:type="textWrapping"/>
+      </w:r>
+      <w:r>
+        <w:rPr>
+          <w:rFonts w:hint="default" w:ascii="Times New Roman" w:hAnsi="Times New Roman" w:eastAsia="SimSun" w:cs="Times New Roman"/>
+          <w:b w:val="0"/>
+          <w:bCs w:val="0"/>
+          <w:i w:val="0"/>
+          <w:iCs w:val="0"/>
+          <w:sz w:val="25"/>
+          <w:szCs w:val="25"/>
+          <w:lang w:val="en-US"/>
+        </w:rPr>
+        <w:br w:type="textWrapping"/>
+      </w:r>
+      <w:r>
+        <w:rPr>
+          <w:rFonts w:hint="default" w:ascii="Times New Roman" w:hAnsi="Times New Roman" w:eastAsia="SimSun" w:cs="Times New Roman"/>
+          <w:b w:val="0"/>
+          <w:bCs w:val="0"/>
+          <w:i w:val="0"/>
+          <w:iCs w:val="0"/>
+          <w:sz w:val="25"/>
+          <w:szCs w:val="25"/>
+          <w:lang w:val="en-US"/>
+        </w:rPr>
+        <w:br w:type="textWrapping"/>
+      </w:r>
+      <w:r>
+        <w:rPr>
+          <w:rFonts w:hint="default" w:ascii="Times New Roman" w:hAnsi="Times New Roman" w:eastAsia="SimSun" w:cs="Times New Roman"/>
+          <w:b w:val="0"/>
+          <w:bCs w:val="0"/>
+          <w:i w:val="0"/>
+          <w:iCs w:val="0"/>
+          <w:sz w:val="25"/>
+          <w:szCs w:val="25"/>
+          <w:lang w:val="en-US"/>
+        </w:rPr>
+        <w:br w:type="textWrapping"/>
+      </w:r>
+      <w:r>
+        <w:rPr>
+          <w:rFonts w:hint="default" w:ascii="Times New Roman" w:hAnsi="Times New Roman" w:eastAsia="SimSun" w:cs="Times New Roman"/>
+          <w:b w:val="0"/>
+          <w:bCs w:val="0"/>
+          <w:i w:val="0"/>
+          <w:iCs w:val="0"/>
+          <w:sz w:val="25"/>
+          <w:szCs w:val="25"/>
+          <w:lang w:val="en-US"/>
+        </w:rPr>
+        <w:br w:type="textWrapping"/>
+      </w:r>
+      <w:r>
+        <w:rPr>
+          <w:rFonts w:hint="default" w:ascii="Times New Roman" w:hAnsi="Times New Roman" w:eastAsia="SimSun" w:cs="Times New Roman"/>
+          <w:b w:val="0"/>
+          <w:bCs w:val="0"/>
+          <w:i w:val="0"/>
+          <w:iCs w:val="0"/>
+          <w:sz w:val="25"/>
+          <w:szCs w:val="25"/>
+          <w:lang w:val="en-US"/>
+        </w:rPr>
+        <w:br w:type="textWrapping"/>
+      </w:r>
+      <w:r>
+        <w:rPr>
+          <w:rFonts w:hint="default" w:ascii="Times New Roman" w:hAnsi="Times New Roman" w:eastAsia="SimSun" w:cs="Times New Roman"/>
+          <w:b/>
+          <w:bCs/>
+          <w:i/>
+          <w:iCs/>
+          <w:sz w:val="21"/>
+          <w:szCs w:val="21"/>
+          <w:lang w:val="en-US"/>
+        </w:rPr>
+        <w:t>Figure 6: Age Distribution of Titanic Passenger.</w:t>
+      </w:r>
     </w:p>
     <w:p>
       <w:pPr>
@@ -2540,6 +3133,472 @@
           <w:lang w:val="en-US"/>
         </w:rPr>
       </w:pPr>
+      <w:r>
+        <w:rPr>
+          <w:rFonts w:hint="default" w:ascii="Times New Roman" w:hAnsi="Times New Roman" w:eastAsia="SimSun" w:cs="Times New Roman"/>
+          <w:b w:val="0"/>
+          <w:bCs w:val="0"/>
+          <w:i w:val="0"/>
+          <w:iCs w:val="0"/>
+          <w:sz w:val="25"/>
+          <w:szCs w:val="25"/>
+          <w:lang w:val="en-US"/>
+        </w:rPr>
+        <w:t>In addition, I use the boxplot to check the Age effect or not to the survival rate.It is clear that age range from 20 to between 30 and 40 has most majority of the dataset</w:t>
+      </w:r>
+    </w:p>
+    <w:p>
+      <w:pPr>
+        <w:numPr>
+          <w:ilvl w:val="0"/>
+          <w:numId w:val="0"/>
+        </w:numPr>
+        <w:shd w:val="clear" w:fill="FFFFFF" w:themeFill="background1"/>
+        <w:spacing w:line="240" w:lineRule="auto"/>
+        <w:jc w:val="center"/>
+        <w:rPr>
+          <w:rFonts w:hint="default" w:ascii="Times New Roman" w:hAnsi="Times New Roman" w:cs="Times New Roman"/>
+          <w:b/>
+          <w:bCs/>
+          <w:i/>
+          <w:iCs/>
+          <w:sz w:val="21"/>
+          <w:szCs w:val="21"/>
+          <w:lang w:val="en-US"/>
+        </w:rPr>
+      </w:pPr>
+      <w:r>
+        <w:rPr>
+          <w:rFonts w:hint="default" w:ascii="Times New Roman" w:hAnsi="Times New Roman" w:eastAsia="SimSun" w:cs="Times New Roman"/>
+          <w:b w:val="0"/>
+          <w:bCs w:val="0"/>
+          <w:i w:val="0"/>
+          <w:iCs w:val="0"/>
+          <w:sz w:val="25"/>
+          <w:szCs w:val="25"/>
+          <w:lang w:val="en-US"/>
+        </w:rPr>
+        <w:br w:type="textWrapping"/>
+      </w:r>
+      <w:r>
+        <w:rPr>
+          <w:rFonts w:hint="default" w:ascii="Times New Roman" w:hAnsi="Times New Roman" w:eastAsia="SimSun" w:cs="Times New Roman"/>
+          <w:b w:val="0"/>
+          <w:bCs w:val="0"/>
+          <w:i w:val="0"/>
+          <w:iCs w:val="0"/>
+          <w:sz w:val="25"/>
+          <w:szCs w:val="25"/>
+          <w:lang w:val="en-US"/>
+        </w:rPr>
+        <w:br w:type="textWrapping"/>
+      </w:r>
+      <w:r>
+        <w:rPr>
+          <w:rFonts w:hint="default" w:ascii="Times New Roman" w:hAnsi="Times New Roman" w:eastAsia="SimSun" w:cs="Times New Roman"/>
+          <w:b w:val="0"/>
+          <w:bCs w:val="0"/>
+          <w:i w:val="0"/>
+          <w:iCs w:val="0"/>
+          <w:sz w:val="25"/>
+          <w:szCs w:val="25"/>
+          <w:lang w:val="en-US"/>
+        </w:rPr>
+        <w:br w:type="textWrapping"/>
+      </w:r>
+      <w:r>
+        <w:rPr>
+          <w:rFonts w:hint="default" w:ascii="Times New Roman" w:hAnsi="Times New Roman" w:eastAsia="SimSun" w:cs="Times New Roman"/>
+          <w:b w:val="0"/>
+          <w:bCs w:val="0"/>
+          <w:i w:val="0"/>
+          <w:iCs w:val="0"/>
+          <w:sz w:val="25"/>
+          <w:szCs w:val="25"/>
+          <w:lang w:val="en-US"/>
+        </w:rPr>
+        <w:br w:type="textWrapping"/>
+      </w:r>
+      <w:r>
+        <w:rPr>
+          <w:rFonts w:hint="default" w:ascii="Times New Roman" w:hAnsi="Times New Roman" w:eastAsia="SimSun" w:cs="Times New Roman"/>
+          <w:b w:val="0"/>
+          <w:bCs w:val="0"/>
+          <w:i w:val="0"/>
+          <w:iCs w:val="0"/>
+          <w:sz w:val="25"/>
+          <w:szCs w:val="25"/>
+          <w:lang w:val="en-US"/>
+        </w:rPr>
+        <w:br w:type="textWrapping"/>
+      </w:r>
+      <w:r>
+        <w:rPr>
+          <w:rFonts w:hint="default" w:ascii="Times New Roman" w:hAnsi="Times New Roman" w:eastAsia="SimSun" w:cs="Times New Roman"/>
+          <w:b w:val="0"/>
+          <w:bCs w:val="0"/>
+          <w:i w:val="0"/>
+          <w:iCs w:val="0"/>
+          <w:sz w:val="25"/>
+          <w:szCs w:val="25"/>
+          <w:lang w:val="en-US"/>
+        </w:rPr>
+        <w:br w:type="textWrapping"/>
+      </w:r>
+      <w:r>
+        <w:rPr>
+          <w:rFonts w:hint="default" w:ascii="Times New Roman" w:hAnsi="Times New Roman" w:eastAsia="SimSun" w:cs="Times New Roman"/>
+          <w:b w:val="0"/>
+          <w:bCs w:val="0"/>
+          <w:i w:val="0"/>
+          <w:iCs w:val="0"/>
+          <w:sz w:val="25"/>
+          <w:szCs w:val="25"/>
+          <w:lang w:val="en-US"/>
+        </w:rPr>
+        <w:br w:type="textWrapping"/>
+      </w:r>
+      <w:r>
+        <w:rPr>
+          <w:rFonts w:hint="default" w:ascii="Times New Roman" w:hAnsi="Times New Roman" w:eastAsia="SimSun" w:cs="Times New Roman"/>
+          <w:b w:val="0"/>
+          <w:bCs w:val="0"/>
+          <w:i w:val="0"/>
+          <w:iCs w:val="0"/>
+          <w:sz w:val="25"/>
+          <w:szCs w:val="25"/>
+          <w:lang w:val="en-US"/>
+        </w:rPr>
+        <w:br w:type="textWrapping"/>
+      </w:r>
+      <w:r>
+        <w:rPr>
+          <w:rFonts w:hint="default" w:ascii="Times New Roman" w:hAnsi="Times New Roman" w:eastAsia="SimSun" w:cs="Times New Roman"/>
+          <w:b w:val="0"/>
+          <w:bCs w:val="0"/>
+          <w:i w:val="0"/>
+          <w:iCs w:val="0"/>
+          <w:sz w:val="25"/>
+          <w:szCs w:val="25"/>
+          <w:lang w:val="en-US"/>
+        </w:rPr>
+        <w:br w:type="textWrapping"/>
+      </w:r>
+      <w:r>
+        <w:rPr>
+          <w:rFonts w:hint="default" w:ascii="Times New Roman" w:hAnsi="Times New Roman" w:eastAsia="SimSun" w:cs="Times New Roman"/>
+          <w:b w:val="0"/>
+          <w:bCs w:val="0"/>
+          <w:i w:val="0"/>
+          <w:iCs w:val="0"/>
+          <w:sz w:val="25"/>
+          <w:szCs w:val="25"/>
+          <w:lang w:val="en-US"/>
+        </w:rPr>
+        <w:br w:type="textWrapping"/>
+      </w:r>
+      <w:r>
+        <w:rPr>
+          <w:rFonts w:hint="default" w:ascii="Times New Roman" w:hAnsi="Times New Roman" w:eastAsia="SimSun" w:cs="Times New Roman"/>
+          <w:b w:val="0"/>
+          <w:bCs w:val="0"/>
+          <w:i w:val="0"/>
+          <w:iCs w:val="0"/>
+          <w:sz w:val="25"/>
+          <w:szCs w:val="25"/>
+          <w:lang w:val="en-US"/>
+        </w:rPr>
+        <w:br w:type="textWrapping"/>
+      </w:r>
+      <w:r>
+        <w:rPr>
+          <w:rFonts w:hint="default" w:ascii="Times New Roman" w:hAnsi="Times New Roman" w:eastAsia="SimSun" w:cs="Times New Roman"/>
+          <w:b w:val="0"/>
+          <w:bCs w:val="0"/>
+          <w:i w:val="0"/>
+          <w:iCs w:val="0"/>
+          <w:sz w:val="25"/>
+          <w:szCs w:val="25"/>
+          <w:lang w:val="en-US"/>
+        </w:rPr>
+        <w:br w:type="textWrapping"/>
+      </w:r>
+      <w:r>
+        <w:rPr>
+          <w:rFonts w:hint="default" w:ascii="Times New Roman" w:hAnsi="Times New Roman" w:eastAsia="SimSun" w:cs="Times New Roman"/>
+          <w:b w:val="0"/>
+          <w:bCs w:val="0"/>
+          <w:i w:val="0"/>
+          <w:iCs w:val="0"/>
+          <w:sz w:val="25"/>
+          <w:szCs w:val="25"/>
+          <w:lang w:val="en-US"/>
+        </w:rPr>
+        <w:br w:type="textWrapping"/>
+      </w:r>
+      <w:r>
+        <w:rPr>
+          <w:rFonts w:hint="default" w:ascii="Times New Roman" w:hAnsi="Times New Roman" w:eastAsia="SimSun" w:cs="Times New Roman"/>
+          <w:b w:val="0"/>
+          <w:bCs w:val="0"/>
+          <w:i w:val="0"/>
+          <w:iCs w:val="0"/>
+          <w:sz w:val="25"/>
+          <w:szCs w:val="25"/>
+          <w:lang w:val="en-US"/>
+        </w:rPr>
+        <w:br w:type="textWrapping"/>
+      </w:r>
+      <w:r>
+        <w:rPr>
+          <w:rFonts w:hint="default" w:ascii="Times New Roman" w:hAnsi="Times New Roman" w:eastAsia="SimSun" w:cs="Times New Roman"/>
+          <w:b w:val="0"/>
+          <w:bCs w:val="0"/>
+          <w:i w:val="0"/>
+          <w:iCs w:val="0"/>
+          <w:sz w:val="25"/>
+          <w:szCs w:val="25"/>
+          <w:lang w:val="en-US"/>
+        </w:rPr>
+        <w:br w:type="textWrapping"/>
+      </w:r>
+      <w:r>
+        <w:rPr>
+          <w:rFonts w:hint="default" w:ascii="Times New Roman" w:hAnsi="Times New Roman" w:eastAsia="SimSun" w:cs="Times New Roman"/>
+          <w:b w:val="0"/>
+          <w:bCs w:val="0"/>
+          <w:i w:val="0"/>
+          <w:iCs w:val="0"/>
+          <w:sz w:val="25"/>
+          <w:szCs w:val="25"/>
+          <w:lang w:val="en-US"/>
+        </w:rPr>
+        <w:br w:type="textWrapping"/>
+      </w:r>
+      <w:r>
+        <w:rPr>
+          <w:rFonts w:hint="default" w:ascii="Times New Roman" w:hAnsi="Times New Roman" w:eastAsia="SimSun" w:cs="Times New Roman"/>
+          <w:b w:val="0"/>
+          <w:bCs w:val="0"/>
+          <w:i w:val="0"/>
+          <w:iCs w:val="0"/>
+          <w:sz w:val="25"/>
+          <w:szCs w:val="25"/>
+          <w:lang w:val="en-US"/>
+        </w:rPr>
+        <w:br w:type="textWrapping"/>
+      </w:r>
+      <w:r>
+        <w:rPr>
+          <w:rFonts w:hint="default" w:ascii="Times New Roman" w:hAnsi="Times New Roman" w:eastAsia="SimSun" w:cs="Times New Roman"/>
+          <w:b w:val="0"/>
+          <w:bCs w:val="0"/>
+          <w:i w:val="0"/>
+          <w:iCs w:val="0"/>
+          <w:sz w:val="25"/>
+          <w:szCs w:val="25"/>
+          <w:lang w:val="en-US"/>
+        </w:rPr>
+        <w:br w:type="textWrapping"/>
+      </w:r>
+      <w:r>
+        <w:rPr>
+          <w:rFonts w:hint="default" w:ascii="Times New Roman" w:hAnsi="Times New Roman" w:cs="Times New Roman"/>
+          <w:b/>
+          <w:bCs/>
+          <w:i/>
+          <w:iCs/>
+          <w:sz w:val="21"/>
+          <w:szCs w:val="21"/>
+        </w:rPr>
+        <w:drawing>
+          <wp:anchor distT="0" distB="0" distL="114300" distR="114300" simplePos="0" relativeHeight="251671552" behindDoc="1" locked="0" layoutInCell="1" allowOverlap="1">
+            <wp:simplePos x="0" y="0"/>
+            <wp:positionH relativeFrom="column">
+              <wp:posOffset>472440</wp:posOffset>
+            </wp:positionH>
+            <wp:positionV relativeFrom="paragraph">
+              <wp:posOffset>113030</wp:posOffset>
+            </wp:positionV>
+            <wp:extent cx="4207510" cy="3060700"/>
+            <wp:effectExtent l="0" t="0" r="44450" b="33020"/>
+            <wp:wrapTight wrapText="bothSides">
+              <wp:wrapPolygon>
+                <wp:start x="0" y="0"/>
+                <wp:lineTo x="0" y="21510"/>
+                <wp:lineTo x="21515" y="21510"/>
+                <wp:lineTo x="21515" y="0"/>
+                <wp:lineTo x="0" y="0"/>
+              </wp:wrapPolygon>
+            </wp:wrapTight>
+            <wp:docPr id="9" name="Picture 4"/>
+            <wp:cNvGraphicFramePr>
+              <a:graphicFrameLocks xmlns:a="http://schemas.openxmlformats.org/drawingml/2006/main" noChangeAspect="1"/>
+            </wp:cNvGraphicFramePr>
+            <a:graphic xmlns:a="http://schemas.openxmlformats.org/drawingml/2006/main">
+              <a:graphicData uri="http://schemas.openxmlformats.org/drawingml/2006/picture">
+                <pic:pic xmlns:pic="http://schemas.openxmlformats.org/drawingml/2006/picture">
+                  <pic:nvPicPr>
+                    <pic:cNvPr id="9" name="Picture 4"/>
+                    <pic:cNvPicPr>
+                      <a:picLocks noChangeAspect="1"/>
+                    </pic:cNvPicPr>
+                  </pic:nvPicPr>
+                  <pic:blipFill>
+                    <a:blip r:embed="rId16"/>
+                    <a:stretch>
+                      <a:fillRect/>
+                    </a:stretch>
+                  </pic:blipFill>
+                  <pic:spPr>
+                    <a:xfrm>
+                      <a:off x="0" y="0"/>
+                      <a:ext cx="4207510" cy="3060700"/>
+                    </a:xfrm>
+                    <a:prstGeom prst="rect">
+                      <a:avLst/>
+                    </a:prstGeom>
+                    <a:noFill/>
+                    <a:ln>
+                      <a:noFill/>
+                    </a:ln>
+                  </pic:spPr>
+                </pic:pic>
+              </a:graphicData>
+            </a:graphic>
+          </wp:anchor>
+        </w:drawing>
+      </w:r>
+      <w:r>
+        <w:rPr>
+          <w:rFonts w:hint="default" w:ascii="Times New Roman" w:hAnsi="Times New Roman" w:cs="Times New Roman"/>
+          <w:b/>
+          <w:bCs/>
+          <w:i/>
+          <w:iCs/>
+          <w:sz w:val="21"/>
+          <w:szCs w:val="21"/>
+          <w:lang w:val="en-US"/>
+        </w:rPr>
+        <w:t>Figure 7: Age Distribution by Survival Status</w:t>
+      </w:r>
+    </w:p>
+    <w:p>
+      <w:pPr>
+        <w:numPr>
+          <w:ilvl w:val="0"/>
+          <w:numId w:val="0"/>
+        </w:numPr>
+        <w:shd w:val="clear" w:fill="FFFFFF" w:themeFill="background1"/>
+        <w:spacing w:line="240" w:lineRule="auto"/>
+        <w:jc w:val="both"/>
+        <w:rPr>
+          <w:rFonts w:hint="default" w:ascii="Times New Roman" w:hAnsi="Times New Roman" w:cs="Times New Roman"/>
+          <w:b w:val="0"/>
+          <w:bCs w:val="0"/>
+          <w:i w:val="0"/>
+          <w:iCs w:val="0"/>
+          <w:sz w:val="25"/>
+          <w:szCs w:val="25"/>
+          <w:lang w:val="en-US"/>
+        </w:rPr>
+      </w:pPr>
+      <w:r>
+        <w:rPr>
+          <w:rFonts w:hint="default" w:ascii="Times New Roman" w:hAnsi="Times New Roman" w:eastAsia="SimSun" w:cs="Times New Roman"/>
+          <w:sz w:val="25"/>
+          <w:szCs w:val="25"/>
+        </w:rPr>
+        <w:t xml:space="preserve">In conclusion, after completing the first lab of Week 1 and conducting additional exploratory data analysis, I gained valuable insights into the dataset. </w:t>
+      </w:r>
+      <w:r>
+        <w:rPr>
+          <w:rFonts w:hint="default" w:ascii="Times New Roman" w:hAnsi="Times New Roman" w:eastAsia="SimSun" w:cs="Times New Roman"/>
+          <w:sz w:val="25"/>
+          <w:szCs w:val="25"/>
+          <w:lang w:val="en-US"/>
+        </w:rPr>
+        <w:t>Moreover, t</w:t>
+      </w:r>
+      <w:r>
+        <w:rPr>
+          <w:rFonts w:hint="default" w:ascii="Times New Roman" w:hAnsi="Times New Roman" w:eastAsia="SimSun" w:cs="Times New Roman"/>
+          <w:sz w:val="25"/>
+          <w:szCs w:val="25"/>
+        </w:rPr>
+        <w:t>his hands-on practical lab allowed me to become familiar with several NumPy and Matplotlib functions and develop my understanding of data analysis at the data insight level</w:t>
+      </w:r>
+      <w:r>
+        <w:rPr>
+          <w:rFonts w:hint="default" w:ascii="Times New Roman" w:hAnsi="Times New Roman" w:eastAsia="SimSun" w:cs="Times New Roman"/>
+          <w:sz w:val="25"/>
+          <w:szCs w:val="25"/>
+          <w:lang w:val="en-US"/>
+        </w:rPr>
+        <w:t xml:space="preserve"> such as how to draw bar graph basically</w:t>
+      </w:r>
+      <w:r>
+        <w:rPr>
+          <w:rFonts w:hint="default" w:ascii="Times New Roman" w:hAnsi="Times New Roman" w:eastAsia="SimSun" w:cs="Times New Roman"/>
+          <w:sz w:val="25"/>
+          <w:szCs w:val="25"/>
+        </w:rPr>
+        <w:t>. Furthermore, the additional ex</w:t>
+      </w:r>
+      <w:r>
+        <w:rPr>
+          <w:rFonts w:hint="default" w:ascii="Times New Roman" w:hAnsi="Times New Roman" w:eastAsia="SimSun" w:cs="Times New Roman"/>
+          <w:sz w:val="25"/>
+          <w:szCs w:val="25"/>
+          <w:lang w:val="en-US"/>
+        </w:rPr>
+        <w:t>ploratory data analysis</w:t>
+      </w:r>
+      <w:r>
+        <w:rPr>
+          <w:rFonts w:hint="default" w:ascii="Times New Roman" w:hAnsi="Times New Roman" w:eastAsia="SimSun" w:cs="Times New Roman"/>
+          <w:sz w:val="25"/>
+          <w:szCs w:val="25"/>
+        </w:rPr>
+        <w:t xml:space="preserve"> provided v</w:t>
+      </w:r>
+      <w:r>
+        <w:rPr>
+          <w:rFonts w:hint="default" w:ascii="Times New Roman" w:hAnsi="Times New Roman" w:eastAsia="SimSun" w:cs="Times New Roman"/>
+          <w:sz w:val="25"/>
+          <w:szCs w:val="25"/>
+          <w:lang w:val="en-US"/>
+        </w:rPr>
+        <w:t>aluable knowledge</w:t>
+      </w:r>
+      <w:r>
+        <w:rPr>
+          <w:rFonts w:hint="default" w:ascii="Times New Roman" w:hAnsi="Times New Roman" w:eastAsia="SimSun" w:cs="Times New Roman"/>
+          <w:sz w:val="25"/>
+          <w:szCs w:val="25"/>
+        </w:rPr>
+        <w:t xml:space="preserve"> on how to explore data, interpret visualisations, and extract meaningful insights from datasets.</w:t>
+      </w:r>
+      <w:r>
+        <w:rPr>
+          <w:rFonts w:hint="default" w:ascii="Times New Roman" w:hAnsi="Times New Roman" w:eastAsia="SimSun" w:cs="Times New Roman"/>
+          <w:sz w:val="25"/>
+          <w:szCs w:val="25"/>
+          <w:lang w:val="en-US"/>
+        </w:rPr>
+        <w:t xml:space="preserve"> In  particularly, I checked two factors including Passenger Class and Age how effect to Survival factor and Age D</w:t>
+      </w:r>
+      <w:bookmarkStart w:id="0" w:name="_GoBack"/>
+      <w:bookmarkEnd w:id="0"/>
+      <w:r>
+        <w:rPr>
+          <w:rFonts w:hint="default" w:ascii="Times New Roman" w:hAnsi="Times New Roman" w:eastAsia="SimSun" w:cs="Times New Roman"/>
+          <w:sz w:val="25"/>
+          <w:szCs w:val="25"/>
+          <w:lang w:val="en-US"/>
+        </w:rPr>
+        <w:t>istribution throgh dataset by using boxplot.</w:t>
+      </w:r>
     </w:p>
     <w:sectPr>
       <w:headerReference r:id="rId5" w:type="default"/>
@@ -2570,7 +3629,7 @@
             <wp:anchor distT="0" distB="0" distL="114300" distR="114300" simplePos="0" relativeHeight="251659264" behindDoc="0" locked="0" layoutInCell="1" allowOverlap="1">
               <wp:simplePos x="0" y="0"/>
               <wp:positionH relativeFrom="margin">
-                <wp:align>center</wp:align>
+                <wp:align>right</wp:align>
               </wp:positionH>
               <wp:positionV relativeFrom="paragraph">
                 <wp:posOffset>0</wp:posOffset>
@@ -2646,7 +3705,7 @@
         </mc:Choice>
         <mc:Fallback>
           <w:pict>
-            <v:shape id="_x0000_s1026" o:spid="_x0000_s1026" o:spt="202" type="#_x0000_t202" style="position:absolute;left:0pt;margin-top:0pt;height:144pt;width:144pt;mso-position-horizontal:center;mso-position-horizontal-relative:margin;mso-wrap-style:none;z-index:251659264;mso-width-relative:page;mso-height-relative:page;" filled="f" stroked="f" coordsize="21600,21600" o:gfxdata="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">
+            <v:shape id="_x0000_s1026" o:spid="_x0000_s1026" o:spt="202" type="#_x0000_t202" style="position:absolute;left:0pt;margin-top:0pt;height:144pt;width:144pt;mso-position-horizontal:right;mso-position-horizontal-relative:margin;mso-wrap-style:none;z-index:251659264;mso-width-relative:page;mso-height-relative:page;" filled="f" stroked="f" coordsize="21600,21600" o:gfxdata="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">
               <v:fill on="f" focussize="0,0"/>
               <v:stroke on="f" weight="0.5pt"/>
               <v:imagedata o:title=""/>
@@ -2700,7 +3759,7 @@
             <wp:anchor distT="0" distB="0" distL="114300" distR="114300" simplePos="0" relativeHeight="251660288" behindDoc="0" locked="0" layoutInCell="1" allowOverlap="1">
               <wp:simplePos x="0" y="0"/>
               <wp:positionH relativeFrom="margin">
-                <wp:align>center</wp:align>
+                <wp:align>right</wp:align>
               </wp:positionH>
               <wp:positionV relativeFrom="paragraph">
                 <wp:posOffset>0</wp:posOffset>
@@ -2782,7 +3841,7 @@
         </mc:Choice>
         <mc:Fallback>
           <w:pict>
-            <v:shape id="_x0000_s1026" o:spid="_x0000_s1026" o:spt="202" type="#_x0000_t202" style="position:absolute;left:0pt;margin-top:0pt;height:144pt;width:144pt;mso-position-horizontal:center;mso-position-horizontal-relative:margin;mso-wrap-style:none;z-index:251660288;mso-width-relative:page;mso-height-relative:page;" filled="f" stroked="f" coordsize="21600,21600" o:gfxdata="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">
+            <v:shape id="_x0000_s1026" o:spid="_x0000_s1026" o:spt="202" type="#_x0000_t202" style="position:absolute;left:0pt;margin-top:0pt;height:144pt;width:144pt;mso-position-horizontal:right;mso-position-horizontal-relative:margin;mso-wrap-style:none;z-index:251660288;mso-width-relative:page;mso-height-relative:page;" filled="f" stroked="f" coordsize="21600,21600" o:gfxdata="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">
               <v:fill on="f" focussize="0,0"/>
               <v:stroke on="f" weight="0.5pt"/>
               <v:imagedata o:title=""/>

</xml_diff>